<commit_message>
Fix corrupt troubleshooting .docx and remove Escalation section
Two fixes:

1. Word could not open LTI_Flow_Troubleshooting.docx ("unreadable
   content"). Cause: the callout paragraphs wrote <w:shd> before <w:pBdr>
   inside <w:pPr>, but the OOXML schema (CT_PPr) requires pBdr before shd.
   Reordered so the border element precedes the shading element;
   validated pPr/tcPr/rPr child ordering is now 0 out-of-order.

2. Removed Section 7 (Escalation) from both the PDF and the Word doc, and
   trimmed the footer's internal repo-path references, per request. PDF is
   now 4 pages.

Co-Authored-By: Claude Opus 4.8 <noreply@anthropic.com>
Claude-Session: https://claude.ai/code/session_014VhFsZGVhtBx9awNmfkGeY
</commit_message>
<xml_diff>
--- a/lti-followup-test/docs/LTI_Flow_Troubleshooting.docx
+++ b/lti-followup-test/docs/LTI_Flow_Troubleshooting.docx
@@ -1133,10 +1133,10 @@
     </w:p>
     <w:p>
       <w:pPr>
-        <w:shd w:val="clear" w:color="auto" w:fill="FFF6EC"/>
         <w:pBdr>
           <w:left w:val="single" w:sz="18" w:space="6" w:color="D99019"/>
         </w:pBdr>
+        <w:shd w:val="clear" w:color="auto" w:fill="FFF6EC"/>
       </w:pPr>
       <w:r>
         <w:rPr>
@@ -1217,10 +1217,10 @@
     </w:p>
     <w:p>
       <w:pPr>
-        <w:shd w:val="clear" w:color="auto" w:fill="FDEEED"/>
         <w:pBdr>
           <w:left w:val="single" w:sz="18" w:space="6" w:color="B42318"/>
         </w:pBdr>
+        <w:shd w:val="clear" w:color="auto" w:fill="FDEEED"/>
       </w:pPr>
       <w:r>
         <w:rPr>
@@ -1302,10 +1302,10 @@
     </w:p>
     <w:p>
       <w:pPr>
-        <w:shd w:val="clear" w:color="auto" w:fill="EEF4FB"/>
         <w:pBdr>
           <w:left w:val="single" w:sz="18" w:space="6" w:color="003DA5"/>
         </w:pBdr>
+        <w:shd w:val="clear" w:color="auto" w:fill="EEF4FB"/>
       </w:pPr>
       <w:r>
         <w:rPr>
@@ -1323,38 +1323,14 @@
         <w:t>concat(Firm, '_LTI_Follow_Up_', WorkshopDate, '.ics') - Firm and Date are passed through untouched, so whatever the QR baked in is exactly what gets fetched.</w:t>
       </w:r>
     </w:p>
-    <w:p>
-      <w:pPr>
-        <w:pBdr>
-          <w:bottom w:val="single" w:sz="6" w:space="2" w:color="CFE0F0"/>
-        </w:pBdr>
-      </w:pPr>
-      <w:r>
-        <w:rPr>
-          <w:rFonts w:ascii="Arial" w:hAnsi="Arial"/>
-          <w:b/>
-          <w:color w:val="003DA5"/>
-          <w:sz w:val="26"/>
-        </w:rPr>
-        <w:t>7.  Escalation</w:t>
-      </w:r>
-    </w:p>
-    <w:p>
-      <w:r>
-        <w:rPr>
-          <w:rFonts w:ascii="Arial" w:hAnsi="Arial"/>
-          <w:sz w:val="20"/>
-        </w:rPr>
-        <w:t>If a run keeps failing after the fixes above, capture: the run URL from run history, the failed action name, the raw error message, and the diagnostic email. Then escalate to the flow owner (cheesin.foong@capitalgroup.com during the test phase). See the full RUNBOOK.md in the project repo for step-by-step failure notes and the production-handover checklist.</w:t>
-      </w:r>
-    </w:p>
+    <w:p/>
     <w:p>
       <w:r>
         <w:rPr>
           <w:color w:val="5D6B78"/>
           <w:sz w:val="16"/>
         </w:rPr>
-        <w:t>Capital Group · Capital Learning — internal troubleshooting reference for the LTI Follow-up Sender Power Automate flow. Keep in sync with flows/flow-a-sender.md and docs/RUNBOOK.md.</w:t>
+        <w:t>Capital Group · Capital Learning — internal troubleshooting reference for the LTI Follow-up Sender Power Automate flow.</w:t>
       </w:r>
     </w:p>
     <w:sectPr>

</xml_diff>